<commit_message>
docs: link Lab 4 PR and Sprint 2 issues
</commit_message>
<xml_diff>
--- a/docs/lab4/LAB4.2-Techvora.docx
+++ b/docs/lab4/LAB4.2-Techvora.docx
@@ -1325,7 +1325,7 @@
                 <w:sz w:val="19"/>
                 <w:szCs w:val="26"/>
               </w:rPr>
-              <w:t>12 story Sprint 2</w:t>
+              <w:t>US-04, 15, 13, 01</w:t>
             </w:r>
           </w:p>
         </w:tc>
@@ -1348,7 +1348,7 @@
                 <w:sz w:val="19"/>
                 <w:szCs w:val="26"/>
               </w:rPr>
-              <w:t>Chưa xác minh theo story</w:t>
+              <w:t>Chưa có branch story</w:t>
             </w:r>
           </w:p>
         </w:tc>
@@ -1371,7 +1371,7 @@
                 <w:sz w:val="19"/>
                 <w:szCs w:val="26"/>
               </w:rPr>
-              <w:t>Chưa có Issue/PR theo story</w:t>
+              <w:t>Issues #7–#10</w:t>
             </w:r>
           </w:p>
         </w:tc>
@@ -1394,7 +1394,7 @@
                 <w:sz w:val="19"/>
                 <w:szCs w:val="26"/>
               </w:rPr>
-              <w:t>Chưa có review story</w:t>
+              <w:t>Chờ SP/owner/review</w:t>
             </w:r>
           </w:p>
         </w:tc>
@@ -1700,7 +1700,7 @@
                 <w:sz w:val="19"/>
                 <w:szCs w:val="26"/>
               </w:rPr>
-              <w:t>codex/readme-showcase (local)</w:t>
+              <w:t>codex/readme-showcase</w:t>
             </w:r>
           </w:p>
         </w:tc>
@@ -1723,7 +1723,7 @@
                 <w:sz w:val="19"/>
                 <w:szCs w:val="26"/>
               </w:rPr>
-              <w:t>Commit local; chưa PR</w:t>
+              <w:t>PR #6 đang mở</w:t>
             </w:r>
           </w:p>
         </w:tc>
@@ -4054,7 +4054,7 @@
           <w:sz w:val="22"/>
           <w:szCs w:val="26"/>
         </w:rPr>
-        <w:t>Chi tiết: docs/lab4/sprint-2.md. Cần chốt SP/owner trước 21/10/2026. Mẫu gốc ghi nhầm LAB 5; phiếu này là LAB 4.2.</w:t>
+        <w:t>Chi tiết: docs/lab4/sprint-2.md. PR #6 và Issues #7–#10 trên GitHub chờ nhóm chốt SP/owner, review trước 21/10/2026. Mẫu gốc ghi nhầm LAB 5; phiếu này là LAB 4.2.</w:t>
       </w:r>
     </w:p>
     <w:sectPr>

</xml_diff>